<commit_message>
162: harden role detection table topology and remove 4-week assumption
</commit_message>
<xml_diff>
--- a/templates/template_tos_finals.docx
+++ b/templates/template_tos_finals.docx
@@ -533,43 +533,8 @@
             <w:tcW w:w="5513" w:type="dxa"/>
           </w:tcPr>
           <w:p>
-            <w:pPr>
-              <w:spacing w:line="288" w:lineRule="auto"/>
-              <w:jc w:val="both"/>
-              <w:rPr>
-                <w:rFonts w:ascii="Arial" w:hAnsi="Arial" w:cs="Arial"/>
-                <w:snapToGrid w:val="0"/>
-                <w:color w:val="000000"/>
-                <w:szCs w:val="20"/>
-              </w:rPr>
-            </w:pPr>
-            <w:r>
-              <w:rPr>
-                <w:rFonts w:ascii="Arial" w:hAnsi="Arial" w:cs="Arial"/>
-                <w:snapToGrid w:val="0"/>
-                <w:color w:val="000000"/>
-                <w:szCs w:val="20"/>
-              </w:rPr>
-              <w:t>2</w:t>
-            </w:r>
-            <w:r>
-              <w:rPr>
-                <w:rFonts w:ascii="Arial" w:hAnsi="Arial" w:cs="Arial"/>
-                <w:snapToGrid w:val="0"/>
-                <w:color w:val="000000"/>
-                <w:szCs w:val="20"/>
-                <w:vertAlign w:val="superscript"/>
-              </w:rPr>
-              <w:t>ND</w:t>
-            </w:r>
-            <w:r>
-              <w:rPr>
-                <w:rFonts w:ascii="Arial" w:hAnsi="Arial" w:cs="Arial"/>
-                <w:snapToGrid w:val="0"/>
-                <w:color w:val="000000"/>
-                <w:szCs w:val="20"/>
-              </w:rPr>
-              <w:t xml:space="preserve"> Semester / 2025 – 2026 (Midterm)</w:t>
+            <w:r>
+              <w:t>2ND Semester / 2025 – 2026 (Finals)</w:t>
             </w:r>
           </w:p>
         </w:tc>

</xml_diff>